<commit_message>
Handleiding startscherm: iOS-16.4 + Firefox/Chrome/Edge kunnen het ook
</commit_message>
<xml_diff>
--- a/handleiding/Handleiding - App op uw startscherm.docx
+++ b/handleiding/Handleiding - App op uw startscherm.docx
@@ -138,33 +138,46 @@
     </w:p>
     <w:p>
       <w:r>
+        <w:t>Sinds iOS 16.4 kan dit ook via Firefox, Chrome en Edge op de iPhone. Belangrijk: uw iOS moet dan bijgewerkt zijn (16.4 of nieuwer) en uw browser redelijk recent. Is dat niet zo, of werkt het niet - gebruik dan altijd Safari (het safari-icoontje), dat werkt op elke iPhone.</w:t>
+      </w:r>
+    </w:p>
+    <w:p>
+      <w:r>
         <w:rPr>
           <w:b/>
         </w:rPr>
-        <w:t xml:space="preserve">Belangrijk: </w:t>
-      </w:r>
-      <w:r>
-        <w:t>op de iPhone kan dit ALLEEN via Safari. Firefox, Chrome, Edge, Opera en Brave kunnen dat op een iPhone niet. Gebruik dus safari: het icoontje van een kompas.</w:t>
-      </w:r>
-    </w:p>
-    <w:p>
-      <w:r>
-        <w:t>•  Open de app in Safari.</w:t>
-      </w:r>
-    </w:p>
-    <w:p>
-      <w:r>
-        <w:t>•  Tik onderaan op het deel-symbool: een vierkantje met een pijl omhoog.</w:t>
-      </w:r>
-    </w:p>
-    <w:p>
-      <w:r>
-        <w:t>•  Tik in het rijtje dat verschijnt op 'Voeg toe aan beginscherm'.</w:t>
-      </w:r>
-    </w:p>
-    <w:p>
-      <w:r>
-        <w:t>•  Tik rechtsboven op 'Toevoegen'.</w:t>
+        <w:t xml:space="preserve">Firefox: </w:t>
+      </w:r>
+      <w:r>
+        <w:t>het deel-icoontje zit in de adresbalk boven. Tik daarop en kies 'Voeg aan startscherm toe'. Bevestig met 'Voeg toe'.</w:t>
+      </w:r>
+    </w:p>
+    <w:p>
+      <w:r>
+        <w:t>•  De app nu op uw startscherm. Tik op het icoontje, dan opent Firefox.</w:t>
+      </w:r>
+    </w:p>
+    <w:p/>
+    <w:p>
+      <w:r>
+        <w:rPr>
+          <w:b/>
+        </w:rPr>
+        <w:t xml:space="preserve">Chrome en Edge: </w:t>
+      </w:r>
+      <w:r>
+        <w:t>tik rechts naast de adresbalk op het deel-icoontje (vierkantje met pijl omhoog) en kies 'Voeg toe aan beginscherm'. Staat die knop er niet? Werk iOS (16.4 of nieuwer) en de browser bij, en probeer opnieuw.</w:t>
+      </w:r>
+    </w:p>
+    <w:p>
+      <w:r>
+        <w:rPr>
+          <w:b/>
+        </w:rPr>
+        <w:t xml:space="preserve">Safari (werkt altijd): </w:t>
+      </w:r>
+      <w:r>
+        <w:t>tik onderaan op het deel-symbool (vierkantje met een pijl omhoog), kies 'Voeg toe aan beginscherm' (of 'Zet op beginscherm'), schakel eventueel 'Open als webapp' in en tik op 'Voeg toe'.</w:t>
       </w:r>
     </w:p>
     <w:p/>
@@ -205,10 +218,10 @@
           <w:noProof/>
         </w:rPr>
         <w:drawing>
-          <wp:inline distT="0" distB="0" distL="0" distR="0" wp14:anchorId="27B1803F" wp14:editId="201165B2">
+          <wp:inline distT="0" distB="0" distL="0" distR="0" wp14:anchorId="1B352DC8" wp14:editId="229A1859">
             <wp:extent cx="1440000" cy="1440000"/>
             <wp:effectExtent l="0" t="0" r="8255" b="8255"/>
-            <wp:docPr id="1200688503" name="Afbeelding 1"/>
+            <wp:docPr id="1460536969" name="Afbeelding 1"/>
             <wp:cNvGraphicFramePr>
               <a:graphicFrameLocks xmlns:a="http://schemas.openxmlformats.org/drawingml/2006/main" noChangeAspect="1"/>
             </wp:cNvGraphicFramePr>
@@ -216,7 +229,7 @@
               <a:graphicData uri="http://schemas.openxmlformats.org/drawingml/2006/picture">
                 <pic:pic xmlns:pic="http://schemas.openxmlformats.org/drawingml/2006/picture">
                   <pic:nvPicPr>
-                    <pic:cNvPr id="1200688503" name=""/>
+                    <pic:cNvPr id="1460536969" name=""/>
                     <pic:cNvPicPr/>
                   </pic:nvPicPr>
                   <pic:blipFill>
@@ -669,7 +682,7 @@
     <w:link w:val="Kop1Char"/>
     <w:uiPriority w:val="9"/>
     <w:qFormat/>
-    <w:rsid w:val="007A4EC8"/>
+    <w:rsid w:val="006778DC"/>
     <w:pPr>
       <w:keepNext/>
       <w:keepLines/>
@@ -691,7 +704,7 @@
     <w:uiPriority w:val="9"/>
     <w:unhideWhenUsed/>
     <w:qFormat/>
-    <w:rsid w:val="007A4EC8"/>
+    <w:rsid w:val="006778DC"/>
     <w:pPr>
       <w:keepNext/>
       <w:keepLines/>
@@ -715,7 +728,7 @@
     <w:semiHidden/>
     <w:unhideWhenUsed/>
     <w:qFormat/>
-    <w:rsid w:val="007A4EC8"/>
+    <w:rsid w:val="006778DC"/>
     <w:pPr>
       <w:keepNext/>
       <w:keepLines/>
@@ -738,7 +751,7 @@
     <w:semiHidden/>
     <w:unhideWhenUsed/>
     <w:qFormat/>
-    <w:rsid w:val="007A4EC8"/>
+    <w:rsid w:val="006778DC"/>
     <w:pPr>
       <w:keepNext/>
       <w:keepLines/>
@@ -761,7 +774,7 @@
     <w:semiHidden/>
     <w:unhideWhenUsed/>
     <w:qFormat/>
-    <w:rsid w:val="007A4EC8"/>
+    <w:rsid w:val="006778DC"/>
     <w:pPr>
       <w:keepNext/>
       <w:keepLines/>
@@ -782,7 +795,7 @@
     <w:semiHidden/>
     <w:unhideWhenUsed/>
     <w:qFormat/>
-    <w:rsid w:val="007A4EC8"/>
+    <w:rsid w:val="006778DC"/>
     <w:pPr>
       <w:keepNext/>
       <w:keepLines/>
@@ -805,7 +818,7 @@
     <w:semiHidden/>
     <w:unhideWhenUsed/>
     <w:qFormat/>
-    <w:rsid w:val="007A4EC8"/>
+    <w:rsid w:val="006778DC"/>
     <w:pPr>
       <w:keepNext/>
       <w:keepLines/>
@@ -826,7 +839,7 @@
     <w:semiHidden/>
     <w:unhideWhenUsed/>
     <w:qFormat/>
-    <w:rsid w:val="007A4EC8"/>
+    <w:rsid w:val="006778DC"/>
     <w:pPr>
       <w:keepNext/>
       <w:keepLines/>
@@ -849,7 +862,7 @@
     <w:semiHidden/>
     <w:unhideWhenUsed/>
     <w:qFormat/>
-    <w:rsid w:val="007A4EC8"/>
+    <w:rsid w:val="006778DC"/>
     <w:pPr>
       <w:keepNext/>
       <w:keepLines/>
@@ -893,7 +906,7 @@
     <w:basedOn w:val="Standaardalinea-lettertype"/>
     <w:link w:val="Kop1"/>
     <w:uiPriority w:val="9"/>
-    <w:rsid w:val="007A4EC8"/>
+    <w:rsid w:val="006778DC"/>
     <w:rPr>
       <w:rFonts w:asciiTheme="majorHAnsi" w:eastAsiaTheme="majorEastAsia" w:hAnsiTheme="majorHAnsi" w:cstheme="majorBidi"/>
       <w:color w:val="0F4761" w:themeColor="accent1" w:themeShade="BF"/>
@@ -906,7 +919,7 @@
     <w:basedOn w:val="Standaardalinea-lettertype"/>
     <w:link w:val="Kop2"/>
     <w:uiPriority w:val="9"/>
-    <w:rsid w:val="007A4EC8"/>
+    <w:rsid w:val="006778DC"/>
     <w:rPr>
       <w:rFonts w:ascii="Arial" w:eastAsiaTheme="majorEastAsia" w:hAnsi="Arial" w:cs="Arial"/>
       <w:b/>
@@ -921,7 +934,7 @@
     <w:link w:val="Kop3"/>
     <w:uiPriority w:val="9"/>
     <w:semiHidden/>
-    <w:rsid w:val="007A4EC8"/>
+    <w:rsid w:val="006778DC"/>
     <w:rPr>
       <w:rFonts w:asciiTheme="minorHAnsi" w:eastAsiaTheme="majorEastAsia" w:hAnsiTheme="minorHAnsi" w:cstheme="majorBidi"/>
       <w:color w:val="0F4761" w:themeColor="accent1" w:themeShade="BF"/>
@@ -935,7 +948,7 @@
     <w:link w:val="Kop4"/>
     <w:uiPriority w:val="9"/>
     <w:semiHidden/>
-    <w:rsid w:val="007A4EC8"/>
+    <w:rsid w:val="006778DC"/>
     <w:rPr>
       <w:rFonts w:asciiTheme="minorHAnsi" w:eastAsiaTheme="majorEastAsia" w:hAnsiTheme="minorHAnsi" w:cstheme="majorBidi"/>
       <w:i/>
@@ -949,7 +962,7 @@
     <w:link w:val="Kop5"/>
     <w:uiPriority w:val="9"/>
     <w:semiHidden/>
-    <w:rsid w:val="007A4EC8"/>
+    <w:rsid w:val="006778DC"/>
     <w:rPr>
       <w:rFonts w:asciiTheme="minorHAnsi" w:eastAsiaTheme="majorEastAsia" w:hAnsiTheme="minorHAnsi" w:cstheme="majorBidi"/>
       <w:color w:val="0F4761" w:themeColor="accent1" w:themeShade="BF"/>
@@ -961,7 +974,7 @@
     <w:link w:val="Kop6"/>
     <w:uiPriority w:val="9"/>
     <w:semiHidden/>
-    <w:rsid w:val="007A4EC8"/>
+    <w:rsid w:val="006778DC"/>
     <w:rPr>
       <w:rFonts w:asciiTheme="minorHAnsi" w:eastAsiaTheme="majorEastAsia" w:hAnsiTheme="minorHAnsi" w:cstheme="majorBidi"/>
       <w:i/>
@@ -975,7 +988,7 @@
     <w:link w:val="Kop7"/>
     <w:uiPriority w:val="9"/>
     <w:semiHidden/>
-    <w:rsid w:val="007A4EC8"/>
+    <w:rsid w:val="006778DC"/>
     <w:rPr>
       <w:rFonts w:asciiTheme="minorHAnsi" w:eastAsiaTheme="majorEastAsia" w:hAnsiTheme="minorHAnsi" w:cstheme="majorBidi"/>
       <w:color w:val="595959" w:themeColor="text1" w:themeTint="A6"/>
@@ -987,7 +1000,7 @@
     <w:link w:val="Kop8"/>
     <w:uiPriority w:val="9"/>
     <w:semiHidden/>
-    <w:rsid w:val="007A4EC8"/>
+    <w:rsid w:val="006778DC"/>
     <w:rPr>
       <w:rFonts w:asciiTheme="minorHAnsi" w:eastAsiaTheme="majorEastAsia" w:hAnsiTheme="minorHAnsi" w:cstheme="majorBidi"/>
       <w:i/>
@@ -1001,7 +1014,7 @@
     <w:link w:val="Kop9"/>
     <w:uiPriority w:val="9"/>
     <w:semiHidden/>
-    <w:rsid w:val="007A4EC8"/>
+    <w:rsid w:val="006778DC"/>
     <w:rPr>
       <w:rFonts w:asciiTheme="minorHAnsi" w:eastAsiaTheme="majorEastAsia" w:hAnsiTheme="minorHAnsi" w:cstheme="majorBidi"/>
       <w:color w:val="272727" w:themeColor="text1" w:themeTint="D8"/>
@@ -1014,7 +1027,7 @@
     <w:link w:val="TitelChar"/>
     <w:uiPriority w:val="10"/>
     <w:qFormat/>
-    <w:rsid w:val="007A4EC8"/>
+    <w:rsid w:val="006778DC"/>
     <w:pPr>
       <w:spacing w:after="80" w:line="240" w:lineRule="auto"/>
       <w:contextualSpacing/>
@@ -1032,7 +1045,7 @@
     <w:basedOn w:val="Standaardalinea-lettertype"/>
     <w:link w:val="Titel"/>
     <w:uiPriority w:val="10"/>
-    <w:rsid w:val="007A4EC8"/>
+    <w:rsid w:val="006778DC"/>
     <w:rPr>
       <w:rFonts w:asciiTheme="majorHAnsi" w:eastAsiaTheme="majorEastAsia" w:hAnsiTheme="majorHAnsi" w:cstheme="majorBidi"/>
       <w:spacing w:val="-10"/>
@@ -1048,7 +1061,7 @@
     <w:link w:val="OndertitelChar"/>
     <w:uiPriority w:val="11"/>
     <w:qFormat/>
-    <w:rsid w:val="007A4EC8"/>
+    <w:rsid w:val="006778DC"/>
     <w:pPr>
       <w:numPr>
         <w:ilvl w:val="1"/>
@@ -1067,7 +1080,7 @@
     <w:basedOn w:val="Standaardalinea-lettertype"/>
     <w:link w:val="Ondertitel"/>
     <w:uiPriority w:val="11"/>
-    <w:rsid w:val="007A4EC8"/>
+    <w:rsid w:val="006778DC"/>
     <w:rPr>
       <w:rFonts w:asciiTheme="minorHAnsi" w:eastAsiaTheme="majorEastAsia" w:hAnsiTheme="minorHAnsi" w:cstheme="majorBidi"/>
       <w:color w:val="595959" w:themeColor="text1" w:themeTint="A6"/>
@@ -1083,7 +1096,7 @@
     <w:link w:val="CitaatChar"/>
     <w:uiPriority w:val="29"/>
     <w:qFormat/>
-    <w:rsid w:val="007A4EC8"/>
+    <w:rsid w:val="006778DC"/>
     <w:pPr>
       <w:spacing w:before="160"/>
       <w:jc w:val="center"/>
@@ -1099,7 +1112,7 @@
     <w:basedOn w:val="Standaardalinea-lettertype"/>
     <w:link w:val="Citaat"/>
     <w:uiPriority w:val="29"/>
-    <w:rsid w:val="007A4EC8"/>
+    <w:rsid w:val="006778DC"/>
     <w:rPr>
       <w:i/>
       <w:iCs/>
@@ -1111,7 +1124,7 @@
     <w:basedOn w:val="Standaard"/>
     <w:uiPriority w:val="34"/>
     <w:qFormat/>
-    <w:rsid w:val="007A4EC8"/>
+    <w:rsid w:val="006778DC"/>
     <w:pPr>
       <w:ind w:left="720"/>
       <w:contextualSpacing/>
@@ -1122,7 +1135,7 @@
     <w:basedOn w:val="Standaardalinea-lettertype"/>
     <w:uiPriority w:val="21"/>
     <w:qFormat/>
-    <w:rsid w:val="007A4EC8"/>
+    <w:rsid w:val="006778DC"/>
     <w:rPr>
       <w:i/>
       <w:iCs/>
@@ -1136,7 +1149,7 @@
     <w:link w:val="DuidelijkcitaatChar"/>
     <w:uiPriority w:val="30"/>
     <w:qFormat/>
-    <w:rsid w:val="007A4EC8"/>
+    <w:rsid w:val="006778DC"/>
     <w:pPr>
       <w:pBdr>
         <w:top w:val="single" w:sz="4" w:space="10" w:color="0F4761" w:themeColor="accent1" w:themeShade="BF"/>
@@ -1157,7 +1170,7 @@
     <w:basedOn w:val="Standaardalinea-lettertype"/>
     <w:link w:val="Duidelijkcitaat"/>
     <w:uiPriority w:val="30"/>
-    <w:rsid w:val="007A4EC8"/>
+    <w:rsid w:val="006778DC"/>
     <w:rPr>
       <w:i/>
       <w:iCs/>
@@ -1169,7 +1182,7 @@
     <w:basedOn w:val="Standaardalinea-lettertype"/>
     <w:uiPriority w:val="32"/>
     <w:qFormat/>
-    <w:rsid w:val="007A4EC8"/>
+    <w:rsid w:val="006778DC"/>
     <w:rPr>
       <w:b/>
       <w:bCs/>

</xml_diff>